<commit_message>
Prepare executable provenance method for JBI submission
</commit_message>
<xml_diff>
--- a/manuscript/jbi/submission_package/JBI_RECORD_STROBE_checklist.docx
+++ b/manuscript/jbi/submission_package/JBI_RECORD_STROBE_checklist.docx
@@ -29,9 +29,17 @@
       <w:tblPr>
         <w:tblStyle w:val="TableGrid"/>
         <w:tblW w:type="auto" w:w="0"/>
-        <w:jc w:val="center"/>
         <w:tblLayout w:type="autofit"/>
         <w:tblLook w:firstColumn="1" w:firstRow="1" w:lastColumn="0" w:lastRow="0" w:noHBand="0" w:noVBand="1" w:val="04A0"/>
+        <w:jc w:val="center"/>
+        <w:tblBorders>
+          <w:top w:val="single" w:sz="10" w:color="17324D"/>
+          <w:bottom w:val="single" w:sz="10" w:color="17324D"/>
+          <w:left w:val="nil" w:sz="0" w:color="FFFFFF"/>
+          <w:right w:val="nil" w:sz="0" w:color="FFFFFF"/>
+          <w:insideH w:val="nil" w:sz="0" w:color="FFFFFF"/>
+          <w:insideV w:val="nil" w:sz="0" w:color="FFFFFF"/>
+        </w:tblBorders>
       </w:tblPr>
       <w:tblGrid>
         <w:gridCol w:w="2412"/>
@@ -54,7 +62,9 @@
               <w:bottom w:w="70" w:type="dxa"/>
               <w:end w:w="80" w:type="dxa"/>
             </w:tcMar>
-            <w:shd w:fill="17324D"/>
+            <w:tcBorders>
+              <w:bottom w:val="single" w:sz="8" w:color="52667A"/>
+            </w:tcBorders>
           </w:tcPr>
           <w:p>
             <w:pPr>
@@ -65,7 +75,7 @@
               <w:rPr>
                 <w:rFonts w:ascii="Calibri" w:hAnsi="Calibri"/>
                 <w:b/>
-                <w:color w:val="FFFFFF"/>
+                <w:color w:val="17324D"/>
                 <w:sz w:val="16"/>
               </w:rPr>
             </w:r>
@@ -73,7 +83,7 @@
               <w:rPr>
                 <w:rFonts w:ascii="Calibri" w:hAnsi="Calibri"/>
                 <w:b/>
-                <w:color w:val="FFFFFF"/>
+                <w:color w:val="17324D"/>
                 <w:sz w:val="16"/>
               </w:rPr>
               <w:t>Item</w:t>
@@ -90,7 +100,9 @@
               <w:bottom w:w="70" w:type="dxa"/>
               <w:end w:w="80" w:type="dxa"/>
             </w:tcMar>
-            <w:shd w:fill="17324D"/>
+            <w:tcBorders>
+              <w:bottom w:val="single" w:sz="8" w:color="52667A"/>
+            </w:tcBorders>
           </w:tcPr>
           <w:p>
             <w:pPr>
@@ -101,7 +113,7 @@
               <w:rPr>
                 <w:rFonts w:ascii="Calibri" w:hAnsi="Calibri"/>
                 <w:b/>
-                <w:color w:val="FFFFFF"/>
+                <w:color w:val="17324D"/>
                 <w:sz w:val="16"/>
               </w:rPr>
             </w:r>
@@ -109,7 +121,7 @@
               <w:rPr>
                 <w:rFonts w:ascii="Calibri" w:hAnsi="Calibri"/>
                 <w:b/>
-                <w:color w:val="FFFFFF"/>
+                <w:color w:val="17324D"/>
                 <w:sz w:val="16"/>
               </w:rPr>
               <w:t>Reporting element</w:t>
@@ -126,7 +138,9 @@
               <w:bottom w:w="70" w:type="dxa"/>
               <w:end w:w="80" w:type="dxa"/>
             </w:tcMar>
-            <w:shd w:fill="17324D"/>
+            <w:tcBorders>
+              <w:bottom w:val="single" w:sz="8" w:color="52667A"/>
+            </w:tcBorders>
           </w:tcPr>
           <w:p>
             <w:pPr>
@@ -137,7 +151,7 @@
               <w:rPr>
                 <w:rFonts w:ascii="Calibri" w:hAnsi="Calibri"/>
                 <w:b/>
-                <w:color w:val="FFFFFF"/>
+                <w:color w:val="17324D"/>
                 <w:sz w:val="16"/>
               </w:rPr>
             </w:r>
@@ -145,7 +159,7 @@
               <w:rPr>
                 <w:rFonts w:ascii="Calibri" w:hAnsi="Calibri"/>
                 <w:b/>
-                <w:color w:val="FFFFFF"/>
+                <w:color w:val="17324D"/>
                 <w:sz w:val="16"/>
               </w:rPr>
               <w:t>Manuscript location</w:t>
@@ -162,7 +176,9 @@
               <w:bottom w:w="70" w:type="dxa"/>
               <w:end w:w="80" w:type="dxa"/>
             </w:tcMar>
-            <w:shd w:fill="17324D"/>
+            <w:tcBorders>
+              <w:bottom w:val="single" w:sz="8" w:color="52667A"/>
+            </w:tcBorders>
           </w:tcPr>
           <w:p>
             <w:pPr>
@@ -173,7 +189,7 @@
               <w:rPr>
                 <w:rFonts w:ascii="Calibri" w:hAnsi="Calibri"/>
                 <w:b/>
-                <w:color w:val="FFFFFF"/>
+                <w:color w:val="17324D"/>
                 <w:sz w:val="16"/>
               </w:rPr>
             </w:r>
@@ -181,7 +197,7 @@
               <w:rPr>
                 <w:rFonts w:ascii="Calibri" w:hAnsi="Calibri"/>
                 <w:b/>
-                <w:color w:val="FFFFFF"/>
+                <w:color w:val="17324D"/>
                 <w:sz w:val="16"/>
               </w:rPr>
               <w:t>Status</w:t>
@@ -328,7 +344,6 @@
               <w:bottom w:w="70" w:type="dxa"/>
               <w:end w:w="80" w:type="dxa"/>
             </w:tcMar>
-            <w:shd w:fill="EAF1F4"/>
           </w:tcPr>
           <w:p>
             <w:pPr>
@@ -359,7 +374,6 @@
               <w:bottom w:w="70" w:type="dxa"/>
               <w:end w:w="80" w:type="dxa"/>
             </w:tcMar>
-            <w:shd w:fill="EAF1F4"/>
           </w:tcPr>
           <w:p>
             <w:pPr>
@@ -390,7 +404,6 @@
               <w:bottom w:w="70" w:type="dxa"/>
               <w:end w:w="80" w:type="dxa"/>
             </w:tcMar>
-            <w:shd w:fill="EAF1F4"/>
           </w:tcPr>
           <w:p>
             <w:pPr>
@@ -421,7 +434,6 @@
               <w:bottom w:w="70" w:type="dxa"/>
               <w:end w:w="80" w:type="dxa"/>
             </w:tcMar>
-            <w:shd w:fill="EAF1F4"/>
           </w:tcPr>
           <w:p>
             <w:pPr>
@@ -582,7 +594,6 @@
               <w:bottom w:w="70" w:type="dxa"/>
               <w:end w:w="80" w:type="dxa"/>
             </w:tcMar>
-            <w:shd w:fill="EAF1F4"/>
           </w:tcPr>
           <w:p>
             <w:pPr>
@@ -613,7 +624,6 @@
               <w:bottom w:w="70" w:type="dxa"/>
               <w:end w:w="80" w:type="dxa"/>
             </w:tcMar>
-            <w:shd w:fill="EAF1F4"/>
           </w:tcPr>
           <w:p>
             <w:pPr>
@@ -644,7 +654,6 @@
               <w:bottom w:w="70" w:type="dxa"/>
               <w:end w:w="80" w:type="dxa"/>
             </w:tcMar>
-            <w:shd w:fill="EAF1F4"/>
           </w:tcPr>
           <w:p>
             <w:pPr>
@@ -675,7 +684,6 @@
               <w:bottom w:w="70" w:type="dxa"/>
               <w:end w:w="80" w:type="dxa"/>
             </w:tcMar>
-            <w:shd w:fill="EAF1F4"/>
           </w:tcPr>
           <w:p>
             <w:pPr>
@@ -836,7 +844,6 @@
               <w:bottom w:w="70" w:type="dxa"/>
               <w:end w:w="80" w:type="dxa"/>
             </w:tcMar>
-            <w:shd w:fill="EAF1F4"/>
           </w:tcPr>
           <w:p>
             <w:pPr>
@@ -867,7 +874,6 @@
               <w:bottom w:w="70" w:type="dxa"/>
               <w:end w:w="80" w:type="dxa"/>
             </w:tcMar>
-            <w:shd w:fill="EAF1F4"/>
           </w:tcPr>
           <w:p>
             <w:pPr>
@@ -898,7 +904,6 @@
               <w:bottom w:w="70" w:type="dxa"/>
               <w:end w:w="80" w:type="dxa"/>
             </w:tcMar>
-            <w:shd w:fill="EAF1F4"/>
           </w:tcPr>
           <w:p>
             <w:pPr>
@@ -929,7 +934,6 @@
               <w:bottom w:w="70" w:type="dxa"/>
               <w:end w:w="80" w:type="dxa"/>
             </w:tcMar>
-            <w:shd w:fill="EAF1F4"/>
           </w:tcPr>
           <w:p>
             <w:pPr>
@@ -1090,7 +1094,6 @@
               <w:bottom w:w="70" w:type="dxa"/>
               <w:end w:w="80" w:type="dxa"/>
             </w:tcMar>
-            <w:shd w:fill="EAF1F4"/>
           </w:tcPr>
           <w:p>
             <w:pPr>
@@ -1121,7 +1124,6 @@
               <w:bottom w:w="70" w:type="dxa"/>
               <w:end w:w="80" w:type="dxa"/>
             </w:tcMar>
-            <w:shd w:fill="EAF1F4"/>
           </w:tcPr>
           <w:p>
             <w:pPr>
@@ -1152,7 +1154,6 @@
               <w:bottom w:w="70" w:type="dxa"/>
               <w:end w:w="80" w:type="dxa"/>
             </w:tcMar>
-            <w:shd w:fill="EAF1F4"/>
           </w:tcPr>
           <w:p>
             <w:pPr>
@@ -1183,7 +1184,6 @@
               <w:bottom w:w="70" w:type="dxa"/>
               <w:end w:w="80" w:type="dxa"/>
             </w:tcMar>
-            <w:shd w:fill="EAF1F4"/>
           </w:tcPr>
           <w:p>
             <w:pPr>
@@ -1344,7 +1344,6 @@
               <w:bottom w:w="70" w:type="dxa"/>
               <w:end w:w="80" w:type="dxa"/>
             </w:tcMar>
-            <w:shd w:fill="EAF1F4"/>
           </w:tcPr>
           <w:p>
             <w:pPr>
@@ -1375,7 +1374,6 @@
               <w:bottom w:w="70" w:type="dxa"/>
               <w:end w:w="80" w:type="dxa"/>
             </w:tcMar>
-            <w:shd w:fill="EAF1F4"/>
           </w:tcPr>
           <w:p>
             <w:pPr>
@@ -1406,7 +1404,6 @@
               <w:bottom w:w="70" w:type="dxa"/>
               <w:end w:w="80" w:type="dxa"/>
             </w:tcMar>
-            <w:shd w:fill="EAF1F4"/>
           </w:tcPr>
           <w:p>
             <w:pPr>
@@ -1437,7 +1434,6 @@
               <w:bottom w:w="70" w:type="dxa"/>
               <w:end w:w="80" w:type="dxa"/>
             </w:tcMar>
-            <w:shd w:fill="EAF1F4"/>
           </w:tcPr>
           <w:p>
             <w:pPr>
@@ -1598,7 +1594,6 @@
               <w:bottom w:w="70" w:type="dxa"/>
               <w:end w:w="80" w:type="dxa"/>
             </w:tcMar>
-            <w:shd w:fill="EAF1F4"/>
           </w:tcPr>
           <w:p>
             <w:pPr>
@@ -1629,7 +1624,6 @@
               <w:bottom w:w="70" w:type="dxa"/>
               <w:end w:w="80" w:type="dxa"/>
             </w:tcMar>
-            <w:shd w:fill="EAF1F4"/>
           </w:tcPr>
           <w:p>
             <w:pPr>
@@ -1660,7 +1654,6 @@
               <w:bottom w:w="70" w:type="dxa"/>
               <w:end w:w="80" w:type="dxa"/>
             </w:tcMar>
-            <w:shd w:fill="EAF1F4"/>
           </w:tcPr>
           <w:p>
             <w:pPr>
@@ -1691,7 +1684,6 @@
               <w:bottom w:w="70" w:type="dxa"/>
               <w:end w:w="80" w:type="dxa"/>
             </w:tcMar>
-            <w:shd w:fill="EAF1F4"/>
           </w:tcPr>
           <w:p>
             <w:pPr>
@@ -1852,7 +1844,6 @@
               <w:bottom w:w="70" w:type="dxa"/>
               <w:end w:w="80" w:type="dxa"/>
             </w:tcMar>
-            <w:shd w:fill="EAF1F4"/>
           </w:tcPr>
           <w:p>
             <w:pPr>
@@ -1883,7 +1874,6 @@
               <w:bottom w:w="70" w:type="dxa"/>
               <w:end w:w="80" w:type="dxa"/>
             </w:tcMar>
-            <w:shd w:fill="EAF1F4"/>
           </w:tcPr>
           <w:p>
             <w:pPr>
@@ -1914,7 +1904,6 @@
               <w:bottom w:w="70" w:type="dxa"/>
               <w:end w:w="80" w:type="dxa"/>
             </w:tcMar>
-            <w:shd w:fill="EAF1F4"/>
           </w:tcPr>
           <w:p>
             <w:pPr>
@@ -1945,7 +1934,6 @@
               <w:bottom w:w="70" w:type="dxa"/>
               <w:end w:w="80" w:type="dxa"/>
             </w:tcMar>
-            <w:shd w:fill="EAF1F4"/>
           </w:tcPr>
           <w:p>
             <w:pPr>
@@ -2106,7 +2094,6 @@
               <w:bottom w:w="70" w:type="dxa"/>
               <w:end w:w="80" w:type="dxa"/>
             </w:tcMar>
-            <w:shd w:fill="EAF1F4"/>
           </w:tcPr>
           <w:p>
             <w:pPr>
@@ -2137,7 +2124,6 @@
               <w:bottom w:w="70" w:type="dxa"/>
               <w:end w:w="80" w:type="dxa"/>
             </w:tcMar>
-            <w:shd w:fill="EAF1F4"/>
           </w:tcPr>
           <w:p>
             <w:pPr>
@@ -2168,7 +2154,6 @@
               <w:bottom w:w="70" w:type="dxa"/>
               <w:end w:w="80" w:type="dxa"/>
             </w:tcMar>
-            <w:shd w:fill="EAF1F4"/>
           </w:tcPr>
           <w:p>
             <w:pPr>
@@ -2199,7 +2184,6 @@
               <w:bottom w:w="70" w:type="dxa"/>
               <w:end w:w="80" w:type="dxa"/>
             </w:tcMar>
-            <w:shd w:fill="EAF1F4"/>
           </w:tcPr>
           <w:p>
             <w:pPr>
@@ -2360,7 +2344,6 @@
               <w:bottom w:w="70" w:type="dxa"/>
               <w:end w:w="80" w:type="dxa"/>
             </w:tcMar>
-            <w:shd w:fill="EAF1F4"/>
           </w:tcPr>
           <w:p>
             <w:pPr>
@@ -2391,7 +2374,6 @@
               <w:bottom w:w="70" w:type="dxa"/>
               <w:end w:w="80" w:type="dxa"/>
             </w:tcMar>
-            <w:shd w:fill="EAF1F4"/>
           </w:tcPr>
           <w:p>
             <w:pPr>
@@ -2422,7 +2404,6 @@
               <w:bottom w:w="70" w:type="dxa"/>
               <w:end w:w="80" w:type="dxa"/>
             </w:tcMar>
-            <w:shd w:fill="EAF1F4"/>
           </w:tcPr>
           <w:p>
             <w:pPr>
@@ -2453,7 +2434,6 @@
               <w:bottom w:w="70" w:type="dxa"/>
               <w:end w:w="80" w:type="dxa"/>
             </w:tcMar>
-            <w:shd w:fill="EAF1F4"/>
           </w:tcPr>
           <w:p>
             <w:pPr>
@@ -2614,7 +2594,6 @@
               <w:bottom w:w="70" w:type="dxa"/>
               <w:end w:w="80" w:type="dxa"/>
             </w:tcMar>
-            <w:shd w:fill="EAF1F4"/>
           </w:tcPr>
           <w:p>
             <w:pPr>
@@ -2645,7 +2624,6 @@
               <w:bottom w:w="70" w:type="dxa"/>
               <w:end w:w="80" w:type="dxa"/>
             </w:tcMar>
-            <w:shd w:fill="EAF1F4"/>
           </w:tcPr>
           <w:p>
             <w:pPr>
@@ -2676,7 +2654,6 @@
               <w:bottom w:w="70" w:type="dxa"/>
               <w:end w:w="80" w:type="dxa"/>
             </w:tcMar>
-            <w:shd w:fill="EAF1F4"/>
           </w:tcPr>
           <w:p>
             <w:pPr>
@@ -2707,7 +2684,6 @@
               <w:bottom w:w="70" w:type="dxa"/>
               <w:end w:w="80" w:type="dxa"/>
             </w:tcMar>
-            <w:shd w:fill="EAF1F4"/>
           </w:tcPr>
           <w:p>
             <w:pPr>
@@ -2868,7 +2844,6 @@
               <w:bottom w:w="70" w:type="dxa"/>
               <w:end w:w="80" w:type="dxa"/>
             </w:tcMar>
-            <w:shd w:fill="EAF1F4"/>
           </w:tcPr>
           <w:p>
             <w:pPr>
@@ -2899,7 +2874,6 @@
               <w:bottom w:w="70" w:type="dxa"/>
               <w:end w:w="80" w:type="dxa"/>
             </w:tcMar>
-            <w:shd w:fill="EAF1F4"/>
           </w:tcPr>
           <w:p>
             <w:pPr>
@@ -2930,7 +2904,6 @@
               <w:bottom w:w="70" w:type="dxa"/>
               <w:end w:w="80" w:type="dxa"/>
             </w:tcMar>
-            <w:shd w:fill="EAF1F4"/>
           </w:tcPr>
           <w:p>
             <w:pPr>
@@ -2961,7 +2934,6 @@
               <w:bottom w:w="70" w:type="dxa"/>
               <w:end w:w="80" w:type="dxa"/>
             </w:tcMar>
-            <w:shd w:fill="EAF1F4"/>
           </w:tcPr>
           <w:p>
             <w:pPr>
@@ -3122,7 +3094,6 @@
               <w:bottom w:w="70" w:type="dxa"/>
               <w:end w:w="80" w:type="dxa"/>
             </w:tcMar>
-            <w:shd w:fill="EAF1F4"/>
           </w:tcPr>
           <w:p>
             <w:pPr>
@@ -3153,7 +3124,6 @@
               <w:bottom w:w="70" w:type="dxa"/>
               <w:end w:w="80" w:type="dxa"/>
             </w:tcMar>
-            <w:shd w:fill="EAF1F4"/>
           </w:tcPr>
           <w:p>
             <w:pPr>
@@ -3184,7 +3154,6 @@
               <w:bottom w:w="70" w:type="dxa"/>
               <w:end w:w="80" w:type="dxa"/>
             </w:tcMar>
-            <w:shd w:fill="EAF1F4"/>
           </w:tcPr>
           <w:p>
             <w:pPr>
@@ -3215,7 +3184,6 @@
               <w:bottom w:w="70" w:type="dxa"/>
               <w:end w:w="80" w:type="dxa"/>
             </w:tcMar>
-            <w:shd w:fill="EAF1F4"/>
           </w:tcPr>
           <w:p>
             <w:pPr>
@@ -3376,7 +3344,6 @@
               <w:bottom w:w="70" w:type="dxa"/>
               <w:end w:w="80" w:type="dxa"/>
             </w:tcMar>
-            <w:shd w:fill="EAF1F4"/>
           </w:tcPr>
           <w:p>
             <w:pPr>
@@ -3407,7 +3374,6 @@
               <w:bottom w:w="70" w:type="dxa"/>
               <w:end w:w="80" w:type="dxa"/>
             </w:tcMar>
-            <w:shd w:fill="EAF1F4"/>
           </w:tcPr>
           <w:p>
             <w:pPr>
@@ -3438,7 +3404,6 @@
               <w:bottom w:w="70" w:type="dxa"/>
               <w:end w:w="80" w:type="dxa"/>
             </w:tcMar>
-            <w:shd w:fill="EAF1F4"/>
           </w:tcPr>
           <w:p>
             <w:pPr>
@@ -3469,7 +3434,6 @@
               <w:bottom w:w="70" w:type="dxa"/>
               <w:end w:w="80" w:type="dxa"/>
             </w:tcMar>
-            <w:shd w:fill="EAF1F4"/>
           </w:tcPr>
           <w:p>
             <w:pPr>
@@ -3630,7 +3594,6 @@
               <w:bottom w:w="70" w:type="dxa"/>
               <w:end w:w="80" w:type="dxa"/>
             </w:tcMar>
-            <w:shd w:fill="EAF1F4"/>
           </w:tcPr>
           <w:p>
             <w:pPr>
@@ -3661,7 +3624,6 @@
               <w:bottom w:w="70" w:type="dxa"/>
               <w:end w:w="80" w:type="dxa"/>
             </w:tcMar>
-            <w:shd w:fill="EAF1F4"/>
           </w:tcPr>
           <w:p>
             <w:pPr>
@@ -3692,7 +3654,6 @@
               <w:bottom w:w="70" w:type="dxa"/>
               <w:end w:w="80" w:type="dxa"/>
             </w:tcMar>
-            <w:shd w:fill="EAF1F4"/>
           </w:tcPr>
           <w:p>
             <w:pPr>
@@ -3723,7 +3684,6 @@
               <w:bottom w:w="70" w:type="dxa"/>
               <w:end w:w="80" w:type="dxa"/>
             </w:tcMar>
-            <w:shd w:fill="EAF1F4"/>
           </w:tcPr>
           <w:p>
             <w:pPr>
@@ -3884,7 +3844,6 @@
               <w:bottom w:w="70" w:type="dxa"/>
               <w:end w:w="80" w:type="dxa"/>
             </w:tcMar>
-            <w:shd w:fill="EAF1F4"/>
           </w:tcPr>
           <w:p>
             <w:pPr>
@@ -3915,7 +3874,6 @@
               <w:bottom w:w="70" w:type="dxa"/>
               <w:end w:w="80" w:type="dxa"/>
             </w:tcMar>
-            <w:shd w:fill="EAF1F4"/>
           </w:tcPr>
           <w:p>
             <w:pPr>
@@ -3946,7 +3904,6 @@
               <w:bottom w:w="70" w:type="dxa"/>
               <w:end w:w="80" w:type="dxa"/>
             </w:tcMar>
-            <w:shd w:fill="EAF1F4"/>
           </w:tcPr>
           <w:p>
             <w:pPr>
@@ -3977,7 +3934,6 @@
               <w:bottom w:w="70" w:type="dxa"/>
               <w:end w:w="80" w:type="dxa"/>
             </w:tcMar>
-            <w:shd w:fill="EAF1F4"/>
           </w:tcPr>
           <w:p>
             <w:pPr>

</xml_diff>

<commit_message>
Finalize JBI submission micro-repairs
</commit_message>
<xml_diff>
--- a/manuscript/jbi/submission_package/JBI_RECORD_STROBE_checklist.docx
+++ b/manuscript/jbi/submission_package/JBI_RECORD_STROBE_checklist.docx
@@ -1670,7 +1670,7 @@
                 <w:rFonts w:ascii="Calibri" w:hAnsi="Calibri"/>
                 <w:sz w:val="16"/>
               </w:rPr>
-              <w:t>Methods 3.5; Table 3; Tables S5–S6 and S14</w:t>
+              <w:t>Methods 3.5; Figure 5; Tables S5–S6 and S14</w:t>
             </w:r>
           </w:p>
         </w:tc>
@@ -2295,7 +2295,7 @@
                 <w:rFonts w:ascii="Calibri" w:hAnsi="Calibri"/>
                 <w:sz w:val="16"/>
               </w:rPr>
-              <w:t>Results 4.6; Table 3; Table S14</w:t>
+              <w:t>Results 4.7; Figure 5; Table S14</w:t>
             </w:r>
           </w:p>
         </w:tc>

</xml_diff>